<commit_message>
fix: md2docx 把 Markdown 链接压成纯文字
方法说明书的目录在 Word 里原本显示成一堆 [零、...](#零...) 的原始语法，
因为 Word 没有锚点跳转，URL 只会变成噪音。

改为在 emit_runs 里剥离链接的地址部分、只保留文字，
这样同一份 Markdown 在 GitHub（有自动目录）和 Word（打印版）里都能读。
</commit_message>
<xml_diff>
--- a/README.docx
+++ b/README.docx
@@ -102,7 +102,7 @@
           <w:rFonts w:ascii="微软雅黑" w:hAnsi="微软雅黑" w:eastAsia="微软雅黑" w:cs="微软雅黑"/>
           <w:b w:val="0"/>
         </w:rPr>
-        <w:t>![Python](https://img.shields.io/badge/Python-3.13-3776AB)</w:t>
+        <w:t>!Python</w:t>
       </w:r>
     </w:p>
     <w:p>
@@ -111,7 +111,7 @@
           <w:rFonts w:ascii="微软雅黑" w:hAnsi="微软雅黑" w:eastAsia="微软雅黑" w:cs="微软雅黑"/>
           <w:b w:val="0"/>
         </w:rPr>
-        <w:t>![DuckDB](https://img.shields.io/badge/DuckDB-1.5-FFF000)</w:t>
+        <w:t>!DuckDB</w:t>
       </w:r>
     </w:p>
     <w:p>
@@ -120,7 +120,7 @@
           <w:rFonts w:ascii="微软雅黑" w:hAnsi="微软雅黑" w:eastAsia="微软雅黑" w:cs="微软雅黑"/>
           <w:b w:val="0"/>
         </w:rPr>
-        <w:t>![SQL](https://img.shields.io/badge/SQL-窗口函数%2FCTE-4479A1)</w:t>
+        <w:t>!SQL</w:t>
       </w:r>
     </w:p>
     <w:p>
@@ -129,7 +129,7 @@
           <w:rFonts w:ascii="微软雅黑" w:hAnsi="微软雅黑" w:eastAsia="微软雅黑" w:cs="微软雅黑"/>
           <w:b w:val="0"/>
         </w:rPr>
-        <w:t>![样本](https://img.shields.io/badge/样本-20%20网点%20×%2090%20天-BLUE)</w:t>
+        <w:t>!样本</w:t>
       </w:r>
     </w:p>
     <w:p>
@@ -138,7 +138,7 @@
           <w:rFonts w:ascii="微软雅黑" w:hAnsi="微软雅黑" w:eastAsia="微软雅黑" w:cs="微软雅黑"/>
           <w:b w:val="0"/>
         </w:rPr>
-        <w:t>![查全率](https://img.shields.io/badge/异常查全率-7%2F7-success)</w:t>
+        <w:t>!查全率</w:t>
       </w:r>
     </w:p>
     <w:p>
@@ -147,7 +147,7 @@
           <w:rFonts w:ascii="微软雅黑" w:hAnsi="微软雅黑" w:eastAsia="微软雅黑" w:cs="微软雅黑"/>
           <w:b w:val="0"/>
         </w:rPr>
-        <w:t>![成因判定](https://img.shields.io/badge/成因判定(3类)-7%2F7-success)</w:t>
+        <w:t>!成因判定-7%2F7-success)</w:t>
       </w:r>
     </w:p>
     <w:p>
@@ -156,7 +156,7 @@
           <w:rFonts w:ascii="微软雅黑" w:hAnsi="微软雅黑" w:eastAsia="微软雅黑" w:cs="微软雅黑"/>
           <w:b w:val="0"/>
         </w:rPr>
-        <w:t>![成因细类](https://img.shields.io/badge/成因判定(细类)-6%2F7-yellow)</w:t>
+        <w:t>!成因细类-6%2F7-yellow)</w:t>
       </w:r>
     </w:p>
     <w:p>
@@ -165,7 +165,7 @@
           <w:rFonts w:ascii="微软雅黑" w:hAnsi="微软雅黑" w:eastAsia="微软雅黑" w:cs="微软雅黑"/>
           <w:b w:val="0"/>
         </w:rPr>
-        <w:t>![License](https://img.shields.io/badge/License-MIT-green)</w:t>
+        <w:t>!License</w:t>
       </w:r>
     </w:p>
     <w:p>
@@ -174,7 +174,7 @@
           <w:rFonts w:ascii="微软雅黑" w:hAnsi="微软雅黑" w:eastAsia="微软雅黑" w:cs="微软雅黑"/>
           <w:b w:val="0"/>
         </w:rPr>
-        <w:t>[![在线打开](https://img.shields.io/badge/%E5%9C%A8%E7%BA%BF%E6%89%93%E5%BC%80-GitHub%20Pages-2E7D6F)](https://arnoldwang-86.github.io/pingan-branch-ops-monitoring/)</w:t>
+        <w:t>![在线打开](https://arnoldwang-86.github.io/pingan-branch-ops-monitoring/)</w:t>
       </w:r>
     </w:p>
     <w:p>
@@ -647,7 +647,7 @@
           <w:rFonts w:ascii="微软雅黑" w:hAnsi="微软雅黑" w:eastAsia="微软雅黑" w:cs="微软雅黑"/>
           <w:b w:val="0"/>
         </w:rPr>
-        <w:t>🤖 [Text-to-Excel Agent](https://arnoldwang-86.github.io/pingan-branch-ops-monitoring/results/%E8%BF%90%E8%90%A5%E9%97%AE%E6%95%B0Agent.html)</w:t>
+        <w:t>🤖 Text-to-Excel Agent</w:t>
       </w:r>
     </w:p>
     <w:p>
@@ -656,7 +656,7 @@
           <w:rFonts w:ascii="微软雅黑" w:hAnsi="微软雅黑" w:eastAsia="微软雅黑" w:cs="微软雅黑"/>
           <w:b w:val="0"/>
         </w:rPr>
-        <w:t>· 📊 [交互式看板](https://arnoldwang-86.github.io/pingan-branch-ops-monitoring/results/%E7%9C%8B%E6%9D%BF.html)</w:t>
+        <w:t>· 📊 交互式看板</w:t>
       </w:r>
     </w:p>
     <w:p>
@@ -1834,7 +1834,7 @@
           <w:rFonts w:ascii="微软雅黑" w:hAnsi="微软雅黑" w:eastAsia="微软雅黑" w:cs="微软雅黑"/>
           <w:b w:val="0"/>
         </w:rPr>
-        <w:t>![Agent 完整工作流程](images/agent-pipeline.png)</w:t>
+        <w:t>!Agent 完整工作流程</w:t>
       </w:r>
     </w:p>
     <w:p>
@@ -2484,7 +2484,7 @@
           <w:rFonts w:ascii="微软雅黑" w:hAnsi="微软雅黑" w:eastAsia="微软雅黑" w:cs="微软雅黑"/>
           <w:b w:val="0"/>
         </w:rPr>
-        <w:t>![预警分析路径](images/agent-alert-analysis.png)</w:t>
+        <w:t>!预警分析路径</w:t>
       </w:r>
     </w:p>
     <w:p>

</xml_diff>